<commit_message>
Update privacy policy text and HTML based on new document
</commit_message>
<xml_diff>
--- a/Privacy_Policy.docx
+++ b/Privacy_Policy.docx
@@ -47,7 +47,7 @@
           <w:sz w:val="20"/>
           <w:szCs w:val="20"/>
         </w:rPr>
-        <w:t xml:space="preserve">Effective Date: 24 May 2026    |    Last Updated: 24 May 2026</w:t>
+        <w:t xml:space="preserve">Effective Date: 1 June 2026    |    Last Updated: 1 June 2026</w:t>
       </w:r>
     </w:p>
     <w:p>
@@ -304,7 +304,7 @@
           <w:sz w:val="22"/>
           <w:szCs w:val="22"/>
         </w:rPr>
-        <w:t xml:space="preserve">Subscription information: tier (free, premium, or max) and entitlement status — note that payment details are handled directly by Apple or Google and we never see your card or banking details</w:t>
+        <w:t xml:space="preserve">Subscription and purchase information: your subscription tier (free, premium, or max), entitlement status, and purchase history — managed via RevenueCat, which stores this against an anonymous App User ID. Note that payment details (card numbers, banking details) are handled directly by Apple or Google and are never seen by us or RevenueCat</w:t>
       </w:r>
     </w:p>
     <w:p>
@@ -1257,6 +1257,357 @@
           <w:sz w:val="24"/>
           <w:szCs w:val="24"/>
         </w:rPr>
+        <w:t xml:space="preserve">6A. Subscription Management and RevenueCat</w:t>
+      </w:r>
+    </w:p>
+    <w:p>
+      <w:pPr>
+        <w:spacing w:after="100" w:before="60"/>
+      </w:pPr>
+      <w:r>
+        <w:rPr>
+          <w:rFonts w:ascii="Arial" w:cs="Arial" w:eastAsia="Arial" w:hAnsi="Arial"/>
+          <w:b w:val="false"/>
+          <w:bCs w:val="false"/>
+          <w:sz w:val="22"/>
+          <w:szCs w:val="22"/>
+        </w:rPr>
+        <w:t xml:space="preserve">Manifest AI: Vision into Life uses RevenueCat to manage in-app subscriptions and purchases across iOS and Android. RevenueCat handles receipt validation, entitlement checks, subscription status syncing between devices, and purchase restoration.</w:t>
+      </w:r>
+    </w:p>
+    <w:p>
+      <w:pPr>
+        <w:spacing w:after="80" w:before="180"/>
+      </w:pPr>
+      <w:r>
+        <w:rPr>
+          <w:rFonts w:ascii="Arial" w:cs="Arial" w:eastAsia="Arial" w:hAnsi="Arial"/>
+          <w:b/>
+          <w:bCs/>
+          <w:color w:val="555577"/>
+          <w:sz w:val="22"/>
+          <w:szCs w:val="22"/>
+        </w:rPr>
+        <w:t xml:space="preserve">6A.1 What RevenueCat Collects</w:t>
+      </w:r>
+    </w:p>
+    <w:p>
+      <w:pPr>
+        <w:spacing w:after="100" w:before="60"/>
+      </w:pPr>
+      <w:r>
+        <w:rPr>
+          <w:rFonts w:ascii="Arial" w:cs="Arial" w:eastAsia="Arial" w:hAnsi="Arial"/>
+          <w:b w:val="false"/>
+          <w:bCs w:val="false"/>
+          <w:sz w:val="22"/>
+          <w:szCs w:val="22"/>
+        </w:rPr>
+        <w:t xml:space="preserve">When you make a purchase or the App checks your subscription status, RevenueCat collects and processes:</w:t>
+      </w:r>
+    </w:p>
+    <w:p>
+      <w:pPr>
+        <w:pStyle w:val="ListParagraph"/>
+        <w:numPr>
+          <w:ilvl w:val="0"/>
+          <w:numId w:val="2"/>
+        </w:numPr>
+        <w:spacing w:after="40" w:before="40"/>
+      </w:pPr>
+      <w:r>
+        <w:rPr>
+          <w:rFonts w:ascii="Arial" w:cs="Arial" w:eastAsia="Arial" w:hAnsi="Arial"/>
+          <w:sz w:val="22"/>
+          <w:szCs w:val="22"/>
+        </w:rPr>
+        <w:t xml:space="preserve">An anonymous App User ID (a randomly generated identifier, not linked to your name or email by default)</w:t>
+      </w:r>
+    </w:p>
+    <w:p>
+      <w:pPr>
+        <w:pStyle w:val="ListParagraph"/>
+        <w:numPr>
+          <w:ilvl w:val="0"/>
+          <w:numId w:val="2"/>
+        </w:numPr>
+        <w:spacing w:after="40" w:before="40"/>
+      </w:pPr>
+      <w:r>
+        <w:rPr>
+          <w:rFonts w:ascii="Arial" w:cs="Arial" w:eastAsia="Arial" w:hAnsi="Arial"/>
+          <w:sz w:val="22"/>
+          <w:szCs w:val="22"/>
+        </w:rPr>
+        <w:t xml:space="preserve">Your purchase history: subscription product ID, purchase date, renewal date, expiry date, and transaction receipts</w:t>
+      </w:r>
+    </w:p>
+    <w:p>
+      <w:pPr>
+        <w:pStyle w:val="ListParagraph"/>
+        <w:numPr>
+          <w:ilvl w:val="0"/>
+          <w:numId w:val="2"/>
+        </w:numPr>
+        <w:spacing w:after="40" w:before="40"/>
+      </w:pPr>
+      <w:r>
+        <w:rPr>
+          <w:rFonts w:ascii="Arial" w:cs="Arial" w:eastAsia="Arial" w:hAnsi="Arial"/>
+          <w:sz w:val="22"/>
+          <w:szCs w:val="22"/>
+        </w:rPr>
+        <w:t xml:space="preserve">Subscription status and entitlement state (free, premium, or max)</w:t>
+      </w:r>
+    </w:p>
+    <w:p>
+      <w:pPr>
+        <w:pStyle w:val="ListParagraph"/>
+        <w:numPr>
+          <w:ilvl w:val="0"/>
+          <w:numId w:val="2"/>
+        </w:numPr>
+        <w:spacing w:after="40" w:before="40"/>
+      </w:pPr>
+      <w:r>
+        <w:rPr>
+          <w:rFonts w:ascii="Arial" w:cs="Arial" w:eastAsia="Arial" w:hAnsi="Arial"/>
+          <w:sz w:val="22"/>
+          <w:szCs w:val="22"/>
+        </w:rPr>
+        <w:t xml:space="preserve">Device type and operating system version (for receipt validation)</w:t>
+      </w:r>
+    </w:p>
+    <w:p>
+      <w:pPr>
+        <w:pStyle w:val="ListParagraph"/>
+        <w:numPr>
+          <w:ilvl w:val="0"/>
+          <w:numId w:val="2"/>
+        </w:numPr>
+        <w:spacing w:after="40" w:before="40"/>
+      </w:pPr>
+      <w:r>
+        <w:rPr>
+          <w:rFonts w:ascii="Arial" w:cs="Arial" w:eastAsia="Arial" w:hAnsi="Arial"/>
+          <w:sz w:val="22"/>
+          <w:szCs w:val="22"/>
+        </w:rPr>
+        <w:t xml:space="preserve">The date you first used the App</w:t>
+      </w:r>
+    </w:p>
+    <w:p>
+      <w:pPr>
+        <w:spacing w:after="100" w:before="60"/>
+      </w:pPr>
+      <w:r>
+        <w:rPr>
+          <w:rFonts w:ascii="Arial" w:cs="Arial" w:eastAsia="Arial" w:hAnsi="Arial"/>
+          <w:b w:val="false"/>
+          <w:bCs w:val="false"/>
+          <w:sz w:val="22"/>
+          <w:szCs w:val="22"/>
+        </w:rPr>
+        <w:t xml:space="preserve">RevenueCat does NOT collect or have access to your payment card details, bank account information, journal entries, goals, or any other personal content you create inside the App.</w:t>
+      </w:r>
+    </w:p>
+    <w:p>
+      <w:pPr>
+        <w:spacing w:after="80" w:before="180"/>
+      </w:pPr>
+      <w:r>
+        <w:rPr>
+          <w:rFonts w:ascii="Arial" w:cs="Arial" w:eastAsia="Arial" w:hAnsi="Arial"/>
+          <w:b/>
+          <w:bCs/>
+          <w:color w:val="555577"/>
+          <w:sz w:val="22"/>
+          <w:szCs w:val="22"/>
+        </w:rPr>
+        <w:t xml:space="preserve">6A.2 How RevenueCat Uses This Data</w:t>
+      </w:r>
+    </w:p>
+    <w:p>
+      <w:pPr>
+        <w:spacing w:after="100" w:before="60"/>
+      </w:pPr>
+      <w:r>
+        <w:rPr>
+          <w:rFonts w:ascii="Arial" w:cs="Arial" w:eastAsia="Arial" w:hAnsi="Arial"/>
+          <w:b w:val="false"/>
+          <w:bCs w:val="false"/>
+          <w:sz w:val="22"/>
+          <w:szCs w:val="22"/>
+        </w:rPr>
+        <w:t xml:space="preserve">RevenueCat uses this data strictly for:</w:t>
+      </w:r>
+    </w:p>
+    <w:p>
+      <w:pPr>
+        <w:pStyle w:val="ListParagraph"/>
+        <w:numPr>
+          <w:ilvl w:val="0"/>
+          <w:numId w:val="2"/>
+        </w:numPr>
+        <w:spacing w:after="40" w:before="40"/>
+      </w:pPr>
+      <w:r>
+        <w:rPr>
+          <w:rFonts w:ascii="Arial" w:cs="Arial" w:eastAsia="Arial" w:hAnsi="Arial"/>
+          <w:sz w:val="22"/>
+          <w:szCs w:val="22"/>
+        </w:rPr>
+        <w:t xml:space="preserve">App Functionality: validating App Store and Play Store receipts to prevent fraud and unlock the correct subscription tier</w:t>
+      </w:r>
+    </w:p>
+    <w:p>
+      <w:pPr>
+        <w:pStyle w:val="ListParagraph"/>
+        <w:numPr>
+          <w:ilvl w:val="0"/>
+          <w:numId w:val="2"/>
+        </w:numPr>
+        <w:spacing w:after="40" w:before="40"/>
+      </w:pPr>
+      <w:r>
+        <w:rPr>
+          <w:rFonts w:ascii="Arial" w:cs="Arial" w:eastAsia="Arial" w:hAnsi="Arial"/>
+          <w:sz w:val="22"/>
+          <w:szCs w:val="22"/>
+        </w:rPr>
+        <w:t xml:space="preserve">Analytics: powering RevenueCat's subscription dashboard so we can understand subscription performance and support users</w:t>
+      </w:r>
+    </w:p>
+    <w:p>
+      <w:pPr>
+        <w:spacing w:after="100" w:before="60"/>
+      </w:pPr>
+      <w:r>
+        <w:rPr>
+          <w:rFonts w:ascii="Arial" w:cs="Arial" w:eastAsia="Arial" w:hAnsi="Arial"/>
+          <w:b w:val="false"/>
+          <w:bCs w:val="false"/>
+          <w:sz w:val="22"/>
+          <w:szCs w:val="22"/>
+        </w:rPr>
+        <w:t xml:space="preserve">RevenueCat does not sell your data and is CCPA and GDPR compliant. RevenueCat acts as a data processor under our instruction — we are the data controller for your information.</w:t>
+      </w:r>
+    </w:p>
+    <w:p>
+      <w:pPr>
+        <w:spacing w:after="80" w:before="180"/>
+      </w:pPr>
+      <w:r>
+        <w:rPr>
+          <w:rFonts w:ascii="Arial" w:cs="Arial" w:eastAsia="Arial" w:hAnsi="Arial"/>
+          <w:b/>
+          <w:bCs/>
+          <w:color w:val="555577"/>
+          <w:sz w:val="22"/>
+          <w:szCs w:val="22"/>
+        </w:rPr>
+        <w:t xml:space="preserve">6A.3 Data Storage</w:t>
+      </w:r>
+    </w:p>
+    <w:p>
+      <w:pPr>
+        <w:spacing w:after="100" w:before="60"/>
+      </w:pPr>
+      <w:r>
+        <w:rPr>
+          <w:rFonts w:ascii="Arial" w:cs="Arial" w:eastAsia="Arial" w:hAnsi="Arial"/>
+          <w:b w:val="false"/>
+          <w:bCs w:val="false"/>
+          <w:sz w:val="22"/>
+          <w:szCs w:val="22"/>
+        </w:rPr>
+        <w:t xml:space="preserve">RevenueCat stores data on Amazon Web Services (AWS) servers in the United States. If you are located outside the US, your purchase and subscription data will be transferred to and stored in the US, subject to RevenueCat's privacy and security standards.</w:t>
+      </w:r>
+    </w:p>
+    <w:p>
+      <w:pPr>
+        <w:spacing w:after="80" w:before="180"/>
+      </w:pPr>
+      <w:r>
+        <w:rPr>
+          <w:rFonts w:ascii="Arial" w:cs="Arial" w:eastAsia="Arial" w:hAnsi="Arial"/>
+          <w:b/>
+          <w:bCs/>
+          <w:color w:val="555577"/>
+          <w:sz w:val="22"/>
+          <w:szCs w:val="22"/>
+        </w:rPr>
+        <w:t xml:space="preserve">6A.4 Data Deletion</w:t>
+      </w:r>
+    </w:p>
+    <w:p>
+      <w:pPr>
+        <w:spacing w:after="100" w:before="60"/>
+      </w:pPr>
+      <w:r>
+        <w:rPr>
+          <w:rFonts w:ascii="Arial" w:cs="Arial" w:eastAsia="Arial" w:hAnsi="Arial"/>
+          <w:b w:val="false"/>
+          <w:bCs w:val="false"/>
+          <w:sz w:val="22"/>
+          <w:szCs w:val="22"/>
+        </w:rPr>
+        <w:t xml:space="preserve">If you delete your account, we will also request deletion of your RevenueCat customer record. You can also contact us at ashwinbadhiye@gmail.com to request manual deletion of your RevenueCat data at any time. For full details, see RevenueCat's privacy policy at revenuecat.com/privacy.</w:t>
+      </w:r>
+    </w:p>
+    <w:p>
+      <w:pPr>
+        <w:spacing w:after="80" w:before="180"/>
+      </w:pPr>
+      <w:r>
+        <w:rPr>
+          <w:rFonts w:ascii="Arial" w:cs="Arial" w:eastAsia="Arial" w:hAnsi="Arial"/>
+          <w:b/>
+          <w:bCs/>
+          <w:color w:val="555577"/>
+          <w:sz w:val="22"/>
+          <w:szCs w:val="22"/>
+        </w:rPr>
+        <w:t xml:space="preserve">6A.5 Store Disclosure Requirement</w:t>
+      </w:r>
+    </w:p>
+    <w:p>
+      <w:pPr>
+        <w:spacing w:after="100" w:before="60"/>
+      </w:pPr>
+      <w:r>
+        <w:rPr>
+          <w:rFonts w:ascii="Arial" w:cs="Arial" w:eastAsia="Arial" w:hAnsi="Arial"/>
+          <w:b w:val="false"/>
+          <w:bCs w:val="false"/>
+          <w:sz w:val="22"/>
+          <w:szCs w:val="22"/>
+        </w:rPr>
+        <w:t xml:space="preserve">In compliance with Google Play's Data Safety requirements and Apple's App Privacy requirements, we disclose that the App collects Purchase History data via RevenueCat. This data is used for App Functionality and Analytics, and is not linked to your personal identity.</w:t>
+      </w:r>
+    </w:p>
+    <w:p>
+      <w:pPr>
+        <w:pBdr>
+          <w:bottom w:val="single" w:color="CCCCCC" w:sz="4" w:space="1"/>
+        </w:pBdr>
+        <w:spacing w:after="160" w:before="160"/>
+      </w:pPr>
+    </w:p>
+    <w:p>
+      <w:pPr>
+        <w:pStyle w:val="Heading2"/>
+        <w:spacing w:after="100" w:before="240"/>
+      </w:pPr>
+      <w:r>
+        <w:rPr>
+          <w:rFonts w:ascii="Arial" w:cs="Arial" w:eastAsia="Arial" w:hAnsi="Arial"/>
+          <w:b/>
+          <w:bCs/>
+          <w:color w:val="4A4A8A"/>
+          <w:sz w:val="24"/>
+          <w:szCs w:val="24"/>
+        </w:rPr>
         <w:t xml:space="preserve">7. Sharing Your Information</w:t>
       </w:r>
     </w:p>
@@ -1290,7 +1641,7 @@
           <w:sz w:val="22"/>
           <w:szCs w:val="22"/>
         </w:rPr>
-        <w:t xml:space="preserve">Service providers acting on our behalf: Google (Firebase services and Gemini API for AI script generation, as described in Section 6), Apple/Google (for authentication and in-app purchases), and Google AdMob (free tier only) — see Section 14 for the complete list</w:t>
+        <w:t xml:space="preserve">Service providers acting on our behalf: Google (Firebase services and Gemini API for AI script generation, as described in Section 6), RevenueCat (subscription and purchase management — see Section 6A), Apple/Google (for authentication and in-app purchases), and Google AdMob (free tier only) — see Section 14 for the complete list</w:t>
       </w:r>
     </w:p>
     <w:p>
@@ -2706,6 +3057,24 @@
           <w:szCs w:val="22"/>
         </w:rPr>
         <w:t xml:space="preserve">Google Gemini API via Firebase AI Logic (AI script generation only, when you request it) — ai.google.dev/gemini-api/terms and policies.google.com/privacy</w:t>
+      </w:r>
+    </w:p>
+    <w:p>
+      <w:pPr>
+        <w:pStyle w:val="ListParagraph"/>
+        <w:numPr>
+          <w:ilvl w:val="0"/>
+          <w:numId w:val="2"/>
+        </w:numPr>
+        <w:spacing w:after="40" w:before="40"/>
+      </w:pPr>
+      <w:r>
+        <w:rPr>
+          <w:rFonts w:ascii="Arial" w:cs="Arial" w:eastAsia="Arial" w:hAnsi="Arial"/>
+          <w:sz w:val="22"/>
+          <w:szCs w:val="22"/>
+        </w:rPr>
+        <w:t xml:space="preserve">RevenueCat (subscription and in-app purchase management) — revenuecat.com/privacy</w:t>
       </w:r>
     </w:p>
     <w:p>

</xml_diff>